<commit_message>
2026C Q3 Q4 done(stability undone), ready for most parts of paper
</commit_message>
<xml_diff>
--- a/2026C_formal/deliver/问题四对应的代码与说明/问题四_代码说明.docx
+++ b/2026C_formal/deliver/问题四对应的代码与说明/问题四_代码说明.docx
@@ -59,6 +59,26 @@
     <w:p>
       <w:r>
         <w:t>报送窗口内，对应第二问的波动电价购电总费用为 16320514.83 元；对应第三问的部分在引入日内价格预测更新后降为 15225713.07 元，降幅 1094801.76 元。</w:t>
+      </w:r>
+    </w:p>
+    <w:p>
+      <w:r>
+        <w:t>作为对照，若假设未来真实电价提前已知，费用可降至 16253521.47 元，与实际 16320514.83 元之差即电价不确定性的代价。</w:t>
+      </w:r>
+    </w:p>
+    <w:p>
+      <w:r>
+        <w:t>若完全不建模电价风险、只按中心价格预测优化，费用为 16298488.17 元，比含价格情景的 16320514.83 元低 22026.66 元（0.14%）。</w:t>
+      </w:r>
+    </w:p>
+    <w:p>
+      <w:r>
+        <w:t>在引入日内价格更新后该差异收窄为 29441.58 元（15196271.49 元 对 15225713.07 元）。</w:t>
+      </w:r>
+    </w:p>
+    <w:p>
+      <w:r>
+        <w:t>两处消融都指向同一结论：在本数据上，电价随机情景并未降低实现费用——中心预测已足够准，按情景对冲反而略偏保守。随机建模的价值在于对价格波动的稳健性（情景可覆盖负电价等极端情形），而不是降低这一条实测价格路径上的费用。</w:t>
       </w:r>
     </w:p>
     <w:p>

</xml_diff>